<commit_message>
obtención del dataset para clasificación no lineal con SVC
</commit_message>
<xml_diff>
--- a/1_curso_machine_learning/0_plan_del_curso/1_programa_curso_machine_learning_python.docx
+++ b/1_curso_machine_learning/0_plan_del_curso/1_programa_curso_machine_learning_python.docx
@@ -1764,7 +1764,23 @@
                 <w:sz w:val="22"/>
                 <w:szCs w:val="22"/>
               </w:rPr>
-              <w:t>Este curso integral está diseñado para proporcionar a los estudiantes una sólida comprensión de los fundamentos del Machine Learning utilizando Python como herramienta principal. Además, se pone un fuerte énfasis en el desarrollo del pensamiento computacional, la promoción de la ciencia abierta a través de GitHub, Visual Studio Code y JupyterLab de Anaconda, así como el fomento de habilidades de comunicación científica en varios lenguajes clave.</w:t>
+              <w:t xml:space="preserve">Este curso integral está diseñado para proporcionar a los estudiantes una sólida comprensión de los fundamentos del Machine Learning utilizando Python como herramienta principal. Además, se pone un fuerte énfasis en el desarrollo del pensamiento computacional, la promoción de la ciencia abierta a través de GitHub, Visual Studio Code, </w:t>
+            </w:r>
+            <w:r>
+              <w:rPr>
+                <w:color w:val="808080"/>
+                <w:sz w:val="22"/>
+                <w:szCs w:val="22"/>
+              </w:rPr>
+              <w:t>Google Colab y Kaggle</w:t>
+            </w:r>
+            <w:r>
+              <w:rPr>
+                <w:color w:val="808080"/>
+                <w:sz w:val="22"/>
+                <w:szCs w:val="22"/>
+              </w:rPr>
+              <w:t xml:space="preserve"> y JupyterLab de Anaconda, así como el fomento de habilidades de comunicación científica en varios lenguajes clave.</w:t>
             </w:r>
           </w:p>
           <w:p>
@@ -2736,21 +2752,25 @@
                 <w:sz w:val="22"/>
                 <w:szCs w:val="22"/>
               </w:rPr>
-              <w:t xml:space="preserve">Al completar este curso, los estudiantes no solo obtendrán habilidades técnicas sólidas en Machine Learning con Python, sino que también desarrollarán habilidades esenciales en pensamiento computacional, ciencia abierta, y comunicación científica, lo que los preparará para enfrentar desafíos del mundo real en el campo de la ciencia de datos.  </w:t>
-            </w:r>
-          </w:p>
-          <w:p>
-            <w:pPr>
-              <w:pStyle w:val="Normal"/>
-              <w:widowControl w:val="false"/>
-              <w:rPr>
-                <w:color w:val="808080"/>
-                <w:sz w:val="22"/>
-                <w:szCs w:val="22"/>
-              </w:rPr>
-            </w:pPr>
-            <w:r>
-              <w:rPr/>
+              <w:t>Al completar este curso, los estudiantes no solo obtendrán habilidades técnicas sólidas en Machine Learning con Python, sino que también desarrollarán habilidades esenciales en pensamiento computacional, ciencia abierta, y comunicación científica, lo que los preparará para enfrentar desafíos del mundo real en el campo de la ciencia de datos.</w:t>
+            </w:r>
+          </w:p>
+          <w:p>
+            <w:pPr>
+              <w:pStyle w:val="Normal"/>
+              <w:widowControl w:val="false"/>
+              <w:rPr>
+                <w:color w:val="808080"/>
+                <w:sz w:val="22"/>
+                <w:szCs w:val="22"/>
+              </w:rPr>
+            </w:pPr>
+            <w:r>
+              <w:rPr>
+                <w:color w:val="808080"/>
+                <w:sz w:val="22"/>
+                <w:szCs w:val="22"/>
+              </w:rPr>
             </w:r>
           </w:p>
           <w:p>
@@ -2779,7 +2799,11 @@
               </w:rPr>
             </w:pPr>
             <w:r>
-              <w:rPr/>
+              <w:rPr>
+                <w:color w:val="808080"/>
+                <w:sz w:val="22"/>
+                <w:szCs w:val="22"/>
+              </w:rPr>
             </w:r>
           </w:p>
           <w:p>
@@ -2808,7 +2832,11 @@
               </w:rPr>
             </w:pPr>
             <w:r>
-              <w:rPr/>
+              <w:rPr>
+                <w:color w:val="808080"/>
+                <w:sz w:val="22"/>
+                <w:szCs w:val="22"/>
+              </w:rPr>
             </w:r>
           </w:p>
           <w:p>
@@ -2852,7 +2880,11 @@
               </w:rPr>
             </w:pPr>
             <w:r>
-              <w:rPr/>
+              <w:rPr>
+                <w:color w:val="808080"/>
+                <w:sz w:val="22"/>
+                <w:szCs w:val="22"/>
+              </w:rPr>
             </w:r>
           </w:p>
           <w:p>
@@ -2896,7 +2928,11 @@
               </w:rPr>
             </w:pPr>
             <w:r>
-              <w:rPr/>
+              <w:rPr>
+                <w:color w:val="808080"/>
+                <w:sz w:val="22"/>
+                <w:szCs w:val="22"/>
+              </w:rPr>
             </w:r>
           </w:p>
           <w:p>
@@ -2940,7 +2976,11 @@
               </w:rPr>
             </w:pPr>
             <w:r>
-              <w:rPr/>
+              <w:rPr>
+                <w:color w:val="808080"/>
+                <w:sz w:val="22"/>
+                <w:szCs w:val="22"/>
+              </w:rPr>
             </w:r>
           </w:p>
           <w:p>
@@ -3134,7 +3174,11 @@
               </w:rPr>
             </w:pPr>
             <w:r>
-              <w:rPr/>
+              <w:rPr>
+                <w:color w:val="808080"/>
+                <w:sz w:val="22"/>
+                <w:szCs w:val="22"/>
+              </w:rPr>
             </w:r>
           </w:p>
           <w:p>
@@ -3186,7 +3230,11 @@
               </w:rPr>
             </w:pPr>
             <w:r>
-              <w:rPr/>
+              <w:rPr>
+                <w:color w:val="808080"/>
+                <w:sz w:val="22"/>
+                <w:szCs w:val="22"/>
+              </w:rPr>
             </w:r>
           </w:p>
           <w:p>
@@ -3219,7 +3267,11 @@
               </w:rPr>
             </w:pPr>
             <w:r>
-              <w:rPr/>
+              <w:rPr>
+                <w:color w:val="808080"/>
+                <w:sz w:val="22"/>
+                <w:szCs w:val="22"/>
+              </w:rPr>
             </w:r>
           </w:p>
           <w:p>
@@ -3252,7 +3304,11 @@
               </w:rPr>
             </w:pPr>
             <w:r>
-              <w:rPr/>
+              <w:rPr>
+                <w:color w:val="808080"/>
+                <w:sz w:val="22"/>
+                <w:szCs w:val="22"/>
+              </w:rPr>
             </w:r>
           </w:p>
           <w:p>
@@ -3339,57 +3395,65 @@
               </w:rPr>
             </w:pPr>
             <w:r>
-              <w:rPr/>
-            </w:r>
-          </w:p>
-          <w:p>
-            <w:pPr>
-              <w:pStyle w:val="Normal"/>
-              <w:widowControl w:val="false"/>
-              <w:rPr>
-                <w:color w:val="808080"/>
-                <w:sz w:val="22"/>
-                <w:szCs w:val="22"/>
-              </w:rPr>
-            </w:pPr>
-            <w:r>
-              <w:rPr>
-                <w:color w:val="808080"/>
-                <w:sz w:val="22"/>
-                <w:szCs w:val="22"/>
-              </w:rPr>
-            </w:r>
-          </w:p>
-          <w:p>
-            <w:pPr>
-              <w:pStyle w:val="Normal"/>
-              <w:widowControl w:val="false"/>
-              <w:rPr>
-                <w:color w:val="808080"/>
-                <w:sz w:val="22"/>
-                <w:szCs w:val="22"/>
-              </w:rPr>
-            </w:pPr>
-            <w:r>
-              <w:rPr>
-                <w:color w:val="808080"/>
-                <w:sz w:val="22"/>
-                <w:szCs w:val="22"/>
-              </w:rPr>
-            </w:r>
-          </w:p>
-          <w:p>
-            <w:pPr>
-              <w:pStyle w:val="Normal"/>
-              <w:widowControl w:val="false"/>
-              <w:rPr>
-                <w:color w:val="808080"/>
-                <w:sz w:val="22"/>
-                <w:szCs w:val="22"/>
-              </w:rPr>
-            </w:pPr>
-            <w:r>
-              <w:rPr/>
+              <w:rPr>
+                <w:color w:val="808080"/>
+                <w:sz w:val="22"/>
+                <w:szCs w:val="22"/>
+              </w:rPr>
+            </w:r>
+          </w:p>
+          <w:p>
+            <w:pPr>
+              <w:pStyle w:val="Normal"/>
+              <w:widowControl w:val="false"/>
+              <w:rPr>
+                <w:color w:val="808080"/>
+                <w:sz w:val="22"/>
+                <w:szCs w:val="22"/>
+              </w:rPr>
+            </w:pPr>
+            <w:r>
+              <w:rPr>
+                <w:color w:val="808080"/>
+                <w:sz w:val="22"/>
+                <w:szCs w:val="22"/>
+              </w:rPr>
+            </w:r>
+          </w:p>
+          <w:p>
+            <w:pPr>
+              <w:pStyle w:val="Normal"/>
+              <w:widowControl w:val="false"/>
+              <w:rPr>
+                <w:color w:val="808080"/>
+                <w:sz w:val="22"/>
+                <w:szCs w:val="22"/>
+              </w:rPr>
+            </w:pPr>
+            <w:r>
+              <w:rPr>
+                <w:color w:val="808080"/>
+                <w:sz w:val="22"/>
+                <w:szCs w:val="22"/>
+              </w:rPr>
+            </w:r>
+          </w:p>
+          <w:p>
+            <w:pPr>
+              <w:pStyle w:val="Normal"/>
+              <w:widowControl w:val="false"/>
+              <w:rPr>
+                <w:color w:val="808080"/>
+                <w:sz w:val="22"/>
+                <w:szCs w:val="22"/>
+              </w:rPr>
+            </w:pPr>
+            <w:r>
+              <w:rPr>
+                <w:color w:val="808080"/>
+                <w:sz w:val="22"/>
+                <w:szCs w:val="22"/>
+              </w:rPr>
             </w:r>
           </w:p>
           <w:p>
@@ -3518,22 +3582,24 @@
               </w:rPr>
             </w:pPr>
             <w:r>
-              <w:rPr/>
-            </w:r>
-          </w:p>
-          <w:p>
-            <w:pPr>
-              <w:pStyle w:val="Normal"/>
-              <w:widowControl w:val="false"/>
-              <w:jc w:val="both"/>
               <w:rPr>
                 <w:u w:val="none"/>
               </w:rPr>
-            </w:pPr>
-            <w:r>
+            </w:r>
+          </w:p>
+          <w:p>
+            <w:pPr>
+              <w:pStyle w:val="Normal"/>
+              <w:widowControl w:val="false"/>
+              <w:jc w:val="both"/>
               <w:rPr>
                 <w:u w:val="none"/>
               </w:rPr>
+            </w:pPr>
+            <w:r>
+              <w:rPr>
+                <w:u w:val="none"/>
+              </w:rPr>
               <w:t>1. **Desarrollar Competencias en Pensamiento Computacional:**</w:t>
             </w:r>
           </w:p>
@@ -3591,22 +3657,24 @@
               </w:rPr>
             </w:pPr>
             <w:r>
-              <w:rPr/>
-            </w:r>
-          </w:p>
-          <w:p>
-            <w:pPr>
-              <w:pStyle w:val="Normal"/>
-              <w:widowControl w:val="false"/>
-              <w:jc w:val="both"/>
               <w:rPr>
                 <w:u w:val="none"/>
               </w:rPr>
-            </w:pPr>
-            <w:r>
+            </w:r>
+          </w:p>
+          <w:p>
+            <w:pPr>
+              <w:pStyle w:val="Normal"/>
+              <w:widowControl w:val="false"/>
+              <w:jc w:val="both"/>
               <w:rPr>
                 <w:u w:val="none"/>
               </w:rPr>
+            </w:pPr>
+            <w:r>
+              <w:rPr>
+                <w:u w:val="none"/>
+              </w:rPr>
               <w:t>2. **Promover el Uso de la Ciencia Libre:**</w:t>
             </w:r>
           </w:p>
@@ -3664,22 +3732,24 @@
               </w:rPr>
             </w:pPr>
             <w:r>
-              <w:rPr/>
-            </w:r>
-          </w:p>
-          <w:p>
-            <w:pPr>
-              <w:pStyle w:val="Normal"/>
-              <w:widowControl w:val="false"/>
-              <w:jc w:val="both"/>
               <w:rPr>
                 <w:u w:val="none"/>
               </w:rPr>
-            </w:pPr>
-            <w:r>
+            </w:r>
+          </w:p>
+          <w:p>
+            <w:pPr>
+              <w:pStyle w:val="Normal"/>
+              <w:widowControl w:val="false"/>
+              <w:jc w:val="both"/>
               <w:rPr>
                 <w:u w:val="none"/>
               </w:rPr>
+            </w:pPr>
+            <w:r>
+              <w:rPr>
+                <w:u w:val="none"/>
+              </w:rPr>
               <w:t>3. **Desarrollar Habilidades Técnicas en Machine Learning:**</w:t>
             </w:r>
           </w:p>
@@ -3737,22 +3807,24 @@
               </w:rPr>
             </w:pPr>
             <w:r>
-              <w:rPr/>
-            </w:r>
-          </w:p>
-          <w:p>
-            <w:pPr>
-              <w:pStyle w:val="Normal"/>
-              <w:widowControl w:val="false"/>
-              <w:jc w:val="both"/>
               <w:rPr>
                 <w:u w:val="none"/>
               </w:rPr>
-            </w:pPr>
-            <w:r>
+            </w:r>
+          </w:p>
+          <w:p>
+            <w:pPr>
+              <w:pStyle w:val="Normal"/>
+              <w:widowControl w:val="false"/>
+              <w:jc w:val="both"/>
               <w:rPr>
                 <w:u w:val="none"/>
               </w:rPr>
+            </w:pPr>
+            <w:r>
+              <w:rPr>
+                <w:u w:val="none"/>
+              </w:rPr>
               <w:t>4. **Incentivar la Participación Activa en la Comunidad Científica:**</w:t>
             </w:r>
           </w:p>
@@ -3810,22 +3882,24 @@
               </w:rPr>
             </w:pPr>
             <w:r>
-              <w:rPr/>
-            </w:r>
-          </w:p>
-          <w:p>
-            <w:pPr>
-              <w:pStyle w:val="Normal"/>
-              <w:widowControl w:val="false"/>
-              <w:jc w:val="both"/>
               <w:rPr>
                 <w:u w:val="none"/>
               </w:rPr>
-            </w:pPr>
-            <w:r>
+            </w:r>
+          </w:p>
+          <w:p>
+            <w:pPr>
+              <w:pStyle w:val="Normal"/>
+              <w:widowControl w:val="false"/>
+              <w:jc w:val="both"/>
               <w:rPr>
                 <w:u w:val="none"/>
               </w:rPr>
+            </w:pPr>
+            <w:r>
+              <w:rPr>
+                <w:u w:val="none"/>
+              </w:rPr>
               <w:t>5. **Desarrollar Habilidades de Comunicación Científica:**</w:t>
             </w:r>
           </w:p>
@@ -3883,22 +3957,24 @@
               </w:rPr>
             </w:pPr>
             <w:r>
-              <w:rPr/>
-            </w:r>
-          </w:p>
-          <w:p>
-            <w:pPr>
-              <w:pStyle w:val="Normal"/>
-              <w:widowControl w:val="false"/>
-              <w:jc w:val="both"/>
               <w:rPr>
                 <w:u w:val="none"/>
               </w:rPr>
-            </w:pPr>
-            <w:r>
+            </w:r>
+          </w:p>
+          <w:p>
+            <w:pPr>
+              <w:pStyle w:val="Normal"/>
+              <w:widowControl w:val="false"/>
+              <w:jc w:val="both"/>
               <w:rPr>
                 <w:u w:val="none"/>
               </w:rPr>
+            </w:pPr>
+            <w:r>
+              <w:rPr>
+                <w:u w:val="none"/>
+              </w:rPr>
               <w:t>6. **Facilitar la Creación de Contenido Educativo:**</w:t>
             </w:r>
           </w:p>
@@ -3956,22 +4032,24 @@
               </w:rPr>
             </w:pPr>
             <w:r>
-              <w:rPr/>
-            </w:r>
-          </w:p>
-          <w:p>
-            <w:pPr>
-              <w:pStyle w:val="Normal"/>
-              <w:widowControl w:val="false"/>
-              <w:jc w:val="both"/>
               <w:rPr>
                 <w:u w:val="none"/>
               </w:rPr>
-            </w:pPr>
-            <w:r>
+            </w:r>
+          </w:p>
+          <w:p>
+            <w:pPr>
+              <w:pStyle w:val="Normal"/>
+              <w:widowControl w:val="false"/>
+              <w:jc w:val="both"/>
               <w:rPr>
                 <w:u w:val="none"/>
               </w:rPr>
+            </w:pPr>
+            <w:r>
+              <w:rPr>
+                <w:u w:val="none"/>
+              </w:rPr>
               <w:t>Estos objetivos específicos están diseñados para abordar aspectos clave del aprendizaje en Machine Learning, desde el desarrollo de habilidades técnicas hasta la promoción de la ciencia abierta y la comunicación científica efectiva, contribuyendo así al logro del objetivo general del curso.</w:t>
             </w:r>
           </w:p>
@@ -3985,26 +4063,21 @@
               </w:rPr>
             </w:pPr>
             <w:r>
+              <w:rPr/>
+            </w:r>
+          </w:p>
+          <w:p>
+            <w:pPr>
+              <w:pStyle w:val="Normal"/>
+              <w:widowControl w:val="false"/>
+              <w:jc w:val="both"/>
               <w:rPr>
                 <w:u w:val="none"/>
               </w:rPr>
-              <w:t xml:space="preserve">  </w:t>
-            </w:r>
-          </w:p>
-          <w:p>
-            <w:pPr>
-              <w:pStyle w:val="Normal"/>
-              <w:widowControl w:val="false"/>
-              <w:jc w:val="both"/>
+            </w:pPr>
+            <w:r>
               <w:rPr>
                 <w:u w:val="none"/>
-              </w:rPr>
-            </w:pPr>
-            <w:r>
-              <w:rPr>
-                <w:b/>
-                <w:sz w:val="22"/>
-                <w:szCs w:val="22"/>
               </w:rPr>
             </w:r>
           </w:p>
@@ -4859,7 +4932,11 @@
               </w:rPr>
             </w:pPr>
             <w:r>
-              <w:rPr/>
+              <w:rPr>
+                <w:color w:val="808080"/>
+                <w:sz w:val="22"/>
+                <w:szCs w:val="22"/>
+              </w:rPr>
             </w:r>
           </w:p>
           <w:p>
@@ -4890,7 +4967,11 @@
               </w:rPr>
             </w:pPr>
             <w:r>
-              <w:rPr/>
+              <w:rPr>
+                <w:color w:val="808080"/>
+                <w:sz w:val="22"/>
+                <w:szCs w:val="22"/>
+              </w:rPr>
             </w:r>
           </w:p>
           <w:p>
@@ -4969,7 +5050,11 @@
               </w:rPr>
             </w:pPr>
             <w:r>
-              <w:rPr/>
+              <w:rPr>
+                <w:color w:val="808080"/>
+                <w:sz w:val="22"/>
+                <w:szCs w:val="22"/>
+              </w:rPr>
             </w:r>
           </w:p>
           <w:p>
@@ -5048,7 +5133,11 @@
               </w:rPr>
             </w:pPr>
             <w:r>
-              <w:rPr/>
+              <w:rPr>
+                <w:color w:val="808080"/>
+                <w:sz w:val="22"/>
+                <w:szCs w:val="22"/>
+              </w:rPr>
             </w:r>
           </w:p>
           <w:p>
@@ -5127,7 +5216,11 @@
               </w:rPr>
             </w:pPr>
             <w:r>
-              <w:rPr/>
+              <w:rPr>
+                <w:color w:val="808080"/>
+                <w:sz w:val="22"/>
+                <w:szCs w:val="22"/>
+              </w:rPr>
             </w:r>
           </w:p>
           <w:p>
@@ -5206,7 +5299,11 @@
               </w:rPr>
             </w:pPr>
             <w:r>
-              <w:rPr/>
+              <w:rPr>
+                <w:color w:val="808080"/>
+                <w:sz w:val="22"/>
+                <w:szCs w:val="22"/>
+              </w:rPr>
             </w:r>
           </w:p>
           <w:p>
@@ -5285,7 +5382,11 @@
               </w:rPr>
             </w:pPr>
             <w:r>
-              <w:rPr/>
+              <w:rPr>
+                <w:color w:val="808080"/>
+                <w:sz w:val="22"/>
+                <w:szCs w:val="22"/>
+              </w:rPr>
             </w:r>
           </w:p>
           <w:p>
@@ -5364,7 +5465,11 @@
               </w:rPr>
             </w:pPr>
             <w:r>
-              <w:rPr/>
+              <w:rPr>
+                <w:color w:val="808080"/>
+                <w:sz w:val="22"/>
+                <w:szCs w:val="22"/>
+              </w:rPr>
             </w:r>
           </w:p>
           <w:p>
@@ -5560,7 +5665,11 @@
               </w:rPr>
             </w:pPr>
             <w:r>
-              <w:rPr/>
+              <w:rPr>
+                <w:color w:val="808080"/>
+                <w:sz w:val="22"/>
+                <w:szCs w:val="22"/>
+              </w:rPr>
             </w:r>
           </w:p>
           <w:p>
@@ -5711,7 +5820,11 @@
               </w:rPr>
             </w:pPr>
             <w:r>
-              <w:rPr/>
+              <w:rPr>
+                <w:color w:val="808080"/>
+                <w:sz w:val="22"/>
+                <w:szCs w:val="22"/>
+              </w:rPr>
             </w:r>
           </w:p>
           <w:p>
@@ -5862,7 +5975,11 @@
               </w:rPr>
             </w:pPr>
             <w:r>
-              <w:rPr/>
+              <w:rPr>
+                <w:color w:val="808080"/>
+                <w:sz w:val="22"/>
+                <w:szCs w:val="22"/>
+              </w:rPr>
             </w:r>
           </w:p>
           <w:p>
@@ -6013,7 +6130,11 @@
               </w:rPr>
             </w:pPr>
             <w:r>
-              <w:rPr/>
+              <w:rPr>
+                <w:color w:val="808080"/>
+                <w:sz w:val="22"/>
+                <w:szCs w:val="22"/>
+              </w:rPr>
             </w:r>
           </w:p>
           <w:p>
@@ -6164,7 +6285,11 @@
               </w:rPr>
             </w:pPr>
             <w:r>
-              <w:rPr/>
+              <w:rPr>
+                <w:color w:val="808080"/>
+                <w:sz w:val="22"/>
+                <w:szCs w:val="22"/>
+              </w:rPr>
             </w:r>
           </w:p>
           <w:p>
@@ -6315,7 +6440,11 @@
               </w:rPr>
             </w:pPr>
             <w:r>
-              <w:rPr/>
+              <w:rPr>
+                <w:color w:val="808080"/>
+                <w:sz w:val="22"/>
+                <w:szCs w:val="22"/>
+              </w:rPr>
             </w:r>
           </w:p>
           <w:p>
@@ -6466,7 +6595,11 @@
               </w:rPr>
             </w:pPr>
             <w:r>
-              <w:rPr/>
+              <w:rPr>
+                <w:color w:val="808080"/>
+                <w:sz w:val="22"/>
+                <w:szCs w:val="22"/>
+              </w:rPr>
             </w:r>
           </w:p>
           <w:p>
@@ -6516,94 +6649,106 @@
               </w:rPr>
             </w:pPr>
             <w:r>
-              <w:rPr/>
-            </w:r>
-          </w:p>
-          <w:p>
-            <w:pPr>
-              <w:pStyle w:val="Normal"/>
-              <w:widowControl w:val="false"/>
-              <w:jc w:val="both"/>
-              <w:rPr>
-                <w:color w:val="808080"/>
-                <w:sz w:val="22"/>
-                <w:szCs w:val="22"/>
-              </w:rPr>
-            </w:pPr>
-            <w:r>
-              <w:rPr>
-                <w:color w:val="808080"/>
-                <w:sz w:val="22"/>
-                <w:szCs w:val="22"/>
-              </w:rPr>
-            </w:r>
-          </w:p>
-          <w:p>
-            <w:pPr>
-              <w:pStyle w:val="Normal"/>
-              <w:widowControl w:val="false"/>
-              <w:jc w:val="both"/>
-              <w:rPr>
-                <w:color w:val="808080"/>
-                <w:sz w:val="22"/>
-                <w:szCs w:val="22"/>
-              </w:rPr>
-            </w:pPr>
-            <w:r>
-              <w:rPr/>
-            </w:r>
-          </w:p>
-          <w:p>
-            <w:pPr>
-              <w:pStyle w:val="Normal"/>
-              <w:widowControl w:val="false"/>
-              <w:jc w:val="both"/>
-              <w:rPr>
-                <w:color w:val="808080"/>
-                <w:sz w:val="22"/>
-                <w:szCs w:val="22"/>
-              </w:rPr>
-            </w:pPr>
-            <w:r>
-              <w:rPr>
-                <w:color w:val="808080"/>
-                <w:sz w:val="22"/>
-                <w:szCs w:val="22"/>
-              </w:rPr>
-            </w:r>
-          </w:p>
-          <w:p>
-            <w:pPr>
-              <w:pStyle w:val="Normal"/>
-              <w:widowControl w:val="false"/>
-              <w:jc w:val="both"/>
-              <w:rPr>
-                <w:color w:val="808080"/>
-                <w:sz w:val="22"/>
-                <w:szCs w:val="22"/>
-              </w:rPr>
-            </w:pPr>
-            <w:r>
-              <w:rPr>
-                <w:color w:val="808080"/>
-                <w:sz w:val="22"/>
-                <w:szCs w:val="22"/>
-              </w:rPr>
-            </w:r>
-          </w:p>
-          <w:p>
-            <w:pPr>
-              <w:pStyle w:val="Normal"/>
-              <w:widowControl w:val="false"/>
-              <w:jc w:val="both"/>
-              <w:rPr>
-                <w:color w:val="808080"/>
-                <w:sz w:val="22"/>
-                <w:szCs w:val="22"/>
-              </w:rPr>
-            </w:pPr>
-            <w:r>
-              <w:rPr/>
+              <w:rPr>
+                <w:color w:val="808080"/>
+                <w:sz w:val="22"/>
+                <w:szCs w:val="22"/>
+              </w:rPr>
+            </w:r>
+          </w:p>
+          <w:p>
+            <w:pPr>
+              <w:pStyle w:val="Normal"/>
+              <w:widowControl w:val="false"/>
+              <w:jc w:val="both"/>
+              <w:rPr>
+                <w:color w:val="808080"/>
+                <w:sz w:val="22"/>
+                <w:szCs w:val="22"/>
+              </w:rPr>
+            </w:pPr>
+            <w:r>
+              <w:rPr>
+                <w:color w:val="808080"/>
+                <w:sz w:val="22"/>
+                <w:szCs w:val="22"/>
+              </w:rPr>
+            </w:r>
+          </w:p>
+          <w:p>
+            <w:pPr>
+              <w:pStyle w:val="Normal"/>
+              <w:widowControl w:val="false"/>
+              <w:jc w:val="both"/>
+              <w:rPr>
+                <w:color w:val="808080"/>
+                <w:sz w:val="22"/>
+                <w:szCs w:val="22"/>
+              </w:rPr>
+            </w:pPr>
+            <w:r>
+              <w:rPr>
+                <w:color w:val="808080"/>
+                <w:sz w:val="22"/>
+                <w:szCs w:val="22"/>
+              </w:rPr>
+            </w:r>
+          </w:p>
+          <w:p>
+            <w:pPr>
+              <w:pStyle w:val="Normal"/>
+              <w:widowControl w:val="false"/>
+              <w:jc w:val="both"/>
+              <w:rPr>
+                <w:color w:val="808080"/>
+                <w:sz w:val="22"/>
+                <w:szCs w:val="22"/>
+              </w:rPr>
+            </w:pPr>
+            <w:r>
+              <w:rPr>
+                <w:color w:val="808080"/>
+                <w:sz w:val="22"/>
+                <w:szCs w:val="22"/>
+              </w:rPr>
+            </w:r>
+          </w:p>
+          <w:p>
+            <w:pPr>
+              <w:pStyle w:val="Normal"/>
+              <w:widowControl w:val="false"/>
+              <w:jc w:val="both"/>
+              <w:rPr>
+                <w:color w:val="808080"/>
+                <w:sz w:val="22"/>
+                <w:szCs w:val="22"/>
+              </w:rPr>
+            </w:pPr>
+            <w:r>
+              <w:rPr>
+                <w:color w:val="808080"/>
+                <w:sz w:val="22"/>
+                <w:szCs w:val="22"/>
+              </w:rPr>
+            </w:r>
+          </w:p>
+          <w:p>
+            <w:pPr>
+              <w:pStyle w:val="Normal"/>
+              <w:widowControl w:val="false"/>
+              <w:jc w:val="both"/>
+              <w:rPr>
+                <w:color w:val="808080"/>
+                <w:sz w:val="22"/>
+                <w:szCs w:val="22"/>
+              </w:rPr>
+            </w:pPr>
+            <w:r>
+              <w:rPr>
+                <w:color w:val="808080"/>
+                <w:sz w:val="22"/>
+                <w:szCs w:val="22"/>
+              </w:rPr>
             </w:r>
           </w:p>
         </w:tc>
@@ -6834,15 +6979,7 @@
                 <w:sz w:val="22"/>
                 <w:szCs w:val="22"/>
               </w:rPr>
-              <w:t xml:space="preserve">Parcial </w:t>
-            </w:r>
-            <w:r>
-              <w:rPr>
-                <w:color w:val="000000"/>
-                <w:sz w:val="22"/>
-                <w:szCs w:val="22"/>
-              </w:rPr>
-              <w:t>2</w:t>
+              <w:t>Parcial 2</w:t>
             </w:r>
           </w:p>
         </w:tc>
@@ -7454,7 +7591,11 @@
               </w:rPr>
             </w:pPr>
             <w:r>
-              <w:rPr/>
+              <w:rPr>
+                <w:sz w:val="22"/>
+                <w:szCs w:val="22"/>
+                <w:u w:val="single"/>
+              </w:rPr>
             </w:r>
           </w:p>
         </w:tc>
@@ -9069,7 +9210,9 @@
       </w:r>
     </w:p>
     <w:sectPr>
-      <w:footerReference w:type="default" r:id="rId3"/>
+      <w:footerReference w:type="even" r:id="rId3"/>
+      <w:footerReference w:type="default" r:id="rId4"/>
+      <w:footerReference w:type="first" r:id="rId5"/>
       <w:footnotePr>
         <w:numFmt w:val="decimal"/>
       </w:footnotePr>
@@ -9086,6 +9229,175 @@
 </file>
 
 <file path=word/footer1.xml><?xml version="1.0" encoding="utf-8"?>
+<w:ftr xmlns:o="urn:schemas-microsoft-com:office:office" xmlns:r="http://schemas.openxmlformats.org/officeDocument/2006/relationships" xmlns:v="urn:schemas-microsoft-com:vml" xmlns:w="http://schemas.openxmlformats.org/wordprocessingml/2006/main" xmlns:w10="urn:schemas-microsoft-com:office:word" xmlns:wp="http://schemas.openxmlformats.org/drawingml/2006/wordprocessingDrawing" xmlns:wps="http://schemas.microsoft.com/office/word/2010/wordprocessingShape" xmlns:wpg="http://schemas.microsoft.com/office/word/2010/wordprocessingGroup" xmlns:mc="http://schemas.openxmlformats.org/markup-compatibility/2006" xmlns:wp14="http://schemas.microsoft.com/office/word/2010/wordprocessingDrawing" xmlns:w14="http://schemas.microsoft.com/office/word/2010/wordml" xmlns:w15="http://schemas.microsoft.com/office/word/2012/wordml" mc:Ignorable="w14 wp14 w15">
+  <w:p>
+    <w:pPr>
+      <w:pStyle w:val="Footer"/>
+      <w:rPr/>
+    </w:pPr>
+    <w:r>
+      <w:rPr/>
+    </w:r>
+  </w:p>
+</w:ftr>
+</file>
+
+<file path=word/footer2.xml><?xml version="1.0" encoding="utf-8"?>
+<w:ftr xmlns:o="urn:schemas-microsoft-com:office:office" xmlns:r="http://schemas.openxmlformats.org/officeDocument/2006/relationships" xmlns:v="urn:schemas-microsoft-com:vml" xmlns:w="http://schemas.openxmlformats.org/wordprocessingml/2006/main" xmlns:w10="urn:schemas-microsoft-com:office:word" xmlns:wp="http://schemas.openxmlformats.org/drawingml/2006/wordprocessingDrawing" xmlns:wps="http://schemas.microsoft.com/office/word/2010/wordprocessingShape" xmlns:wpg="http://schemas.microsoft.com/office/word/2010/wordprocessingGroup" xmlns:mc="http://schemas.openxmlformats.org/markup-compatibility/2006" xmlns:wp14="http://schemas.microsoft.com/office/word/2010/wordprocessingDrawing" xmlns:w14="http://schemas.microsoft.com/office/word/2010/wordml" xmlns:w15="http://schemas.microsoft.com/office/word/2012/wordml" mc:Ignorable="w14 wp14 w15">
+  <w:p>
+    <w:pPr>
+      <w:pStyle w:val="Normal"/>
+      <w:tabs>
+        <w:tab w:val="clear" w:pos="720"/>
+        <w:tab w:val="center" w:pos="4252" w:leader="none"/>
+        <w:tab w:val="right" w:pos="8504" w:leader="none"/>
+      </w:tabs>
+      <w:jc w:val="right"/>
+      <w:rPr>
+        <w:rFonts w:ascii="Calibri" w:hAnsi="Calibri" w:eastAsia="Calibri" w:cs="Calibri"/>
+        <w:color w:val="000000"/>
+        <w:sz w:val="20"/>
+        <w:szCs w:val="20"/>
+      </w:rPr>
+    </w:pPr>
+    <w:r>
+      <w:rPr>
+        <w:rFonts w:eastAsia="Calibri" w:cs="Calibri" w:ascii="Calibri" w:hAnsi="Calibri"/>
+        <w:color w:val="000000"/>
+        <w:sz w:val="20"/>
+        <w:szCs w:val="20"/>
+      </w:rPr>
+      <w:t xml:space="preserve">Página </w:t>
+    </w:r>
+    <w:r>
+      <w:rPr>
+        <w:rFonts w:eastAsia="Calibri" w:cs="Calibri" w:ascii="Calibri" w:hAnsi="Calibri"/>
+        <w:color w:val="000000"/>
+        <w:sz w:val="20"/>
+        <w:szCs w:val="20"/>
+      </w:rPr>
+      <w:fldChar w:fldCharType="begin"/>
+    </w:r>
+    <w:r>
+      <w:rPr>
+        <w:sz w:val="20"/>
+        <w:szCs w:val="20"/>
+        <w:rFonts w:eastAsia="Calibri" w:cs="Calibri" w:ascii="Calibri" w:hAnsi="Calibri"/>
+        <w:color w:val="000000"/>
+      </w:rPr>
+      <w:instrText xml:space="preserve"> PAGE </w:instrText>
+    </w:r>
+    <w:r>
+      <w:rPr>
+        <w:sz w:val="20"/>
+        <w:szCs w:val="20"/>
+        <w:rFonts w:eastAsia="Calibri" w:cs="Calibri" w:ascii="Calibri" w:hAnsi="Calibri"/>
+        <w:color w:val="000000"/>
+      </w:rPr>
+      <w:fldChar w:fldCharType="separate"/>
+    </w:r>
+    <w:r>
+      <w:rPr>
+        <w:sz w:val="20"/>
+        <w:szCs w:val="20"/>
+        <w:rFonts w:eastAsia="Calibri" w:cs="Calibri" w:ascii="Calibri" w:hAnsi="Calibri"/>
+        <w:color w:val="000000"/>
+      </w:rPr>
+      <w:t>10</w:t>
+    </w:r>
+    <w:r>
+      <w:rPr>
+        <w:sz w:val="20"/>
+        <w:szCs w:val="20"/>
+        <w:rFonts w:eastAsia="Calibri" w:cs="Calibri" w:ascii="Calibri" w:hAnsi="Calibri"/>
+        <w:color w:val="000000"/>
+      </w:rPr>
+      <w:fldChar w:fldCharType="end"/>
+    </w:r>
+    <w:r>
+      <w:rPr>
+        <w:rFonts w:eastAsia="Calibri" w:cs="Calibri" w:ascii="Calibri" w:hAnsi="Calibri"/>
+        <w:color w:val="000000"/>
+        <w:sz w:val="20"/>
+        <w:szCs w:val="20"/>
+      </w:rPr>
+      <w:t xml:space="preserve"> de </w:t>
+    </w:r>
+    <w:r>
+      <w:rPr>
+        <w:rFonts w:eastAsia="Calibri" w:cs="Calibri" w:ascii="Calibri" w:hAnsi="Calibri"/>
+        <w:color w:val="000000"/>
+        <w:sz w:val="20"/>
+        <w:szCs w:val="20"/>
+      </w:rPr>
+      <w:fldChar w:fldCharType="begin"/>
+    </w:r>
+    <w:r>
+      <w:rPr>
+        <w:sz w:val="20"/>
+        <w:szCs w:val="20"/>
+        <w:rFonts w:eastAsia="Calibri" w:cs="Calibri" w:ascii="Calibri" w:hAnsi="Calibri"/>
+        <w:color w:val="000000"/>
+      </w:rPr>
+      <w:instrText xml:space="preserve"> NUMPAGES </w:instrText>
+    </w:r>
+    <w:r>
+      <w:rPr>
+        <w:sz w:val="20"/>
+        <w:szCs w:val="20"/>
+        <w:rFonts w:eastAsia="Calibri" w:cs="Calibri" w:ascii="Calibri" w:hAnsi="Calibri"/>
+        <w:color w:val="000000"/>
+      </w:rPr>
+      <w:fldChar w:fldCharType="separate"/>
+    </w:r>
+    <w:r>
+      <w:rPr>
+        <w:sz w:val="20"/>
+        <w:szCs w:val="20"/>
+        <w:rFonts w:eastAsia="Calibri" w:cs="Calibri" w:ascii="Calibri" w:hAnsi="Calibri"/>
+        <w:color w:val="000000"/>
+      </w:rPr>
+      <w:t>10</w:t>
+    </w:r>
+    <w:r>
+      <w:rPr>
+        <w:sz w:val="20"/>
+        <w:szCs w:val="20"/>
+        <w:rFonts w:eastAsia="Calibri" w:cs="Calibri" w:ascii="Calibri" w:hAnsi="Calibri"/>
+        <w:color w:val="000000"/>
+      </w:rPr>
+      <w:fldChar w:fldCharType="end"/>
+    </w:r>
+  </w:p>
+  <w:p>
+    <w:pPr>
+      <w:pStyle w:val="Normal"/>
+      <w:tabs>
+        <w:tab w:val="clear" w:pos="720"/>
+        <w:tab w:val="center" w:pos="4252" w:leader="none"/>
+        <w:tab w:val="right" w:pos="8504" w:leader="none"/>
+      </w:tabs>
+      <w:rPr>
+        <w:rFonts w:ascii="Calibri" w:hAnsi="Calibri" w:eastAsia="Calibri" w:cs="Calibri"/>
+        <w:color w:val="000000"/>
+        <w:sz w:val="20"/>
+        <w:szCs w:val="20"/>
+      </w:rPr>
+    </w:pPr>
+    <w:r>
+      <w:rPr>
+        <w:rFonts w:eastAsia="Calibri" w:cs="Calibri" w:ascii="Calibri" w:hAnsi="Calibri"/>
+        <w:color w:val="000000"/>
+        <w:sz w:val="20"/>
+        <w:szCs w:val="20"/>
+      </w:rPr>
+      <w:t>VD-FO-003, Versión 03</w:t>
+    </w:r>
+  </w:p>
+</w:ftr>
+</file>
+
+<file path=word/footer3.xml><?xml version="1.0" encoding="utf-8"?>
 <w:ftr xmlns:o="urn:schemas-microsoft-com:office:office" xmlns:r="http://schemas.openxmlformats.org/officeDocument/2006/relationships" xmlns:v="urn:schemas-microsoft-com:vml" xmlns:w="http://schemas.openxmlformats.org/wordprocessingml/2006/main" xmlns:w10="urn:schemas-microsoft-com:office:word" xmlns:wp="http://schemas.openxmlformats.org/drawingml/2006/wordprocessingDrawing" xmlns:wps="http://schemas.microsoft.com/office/word/2010/wordprocessingShape" xmlns:wpg="http://schemas.microsoft.com/office/word/2010/wordprocessingGroup" xmlns:mc="http://schemas.openxmlformats.org/markup-compatibility/2006" xmlns:wp14="http://schemas.microsoft.com/office/word/2010/wordprocessingDrawing" xmlns:w14="http://schemas.microsoft.com/office/word/2010/wordml" xmlns:w15="http://schemas.microsoft.com/office/word/2012/wordml" mc:Ignorable="w14 wp14 w15">
   <w:p>
     <w:pPr>
@@ -9281,7 +9593,7 @@
       </w:pPr>
       <w:r>
         <w:rPr>
-          <w:rStyle w:val="Caracteresdenotaalpie"/>
+          <w:rStyle w:val="FootnoteCharacters"/>
         </w:rPr>
         <w:footnoteRef/>
       </w:r>
@@ -9317,7 +9629,7 @@
       </w:pPr>
       <w:r>
         <w:rPr>
-          <w:rStyle w:val="Caracteresdenotaalpie"/>
+          <w:rStyle w:val="FootnoteCharacters"/>
         </w:rPr>
         <w:footnoteRef/>
       </w:r>
@@ -10355,6 +10667,13 @@
       <w:vertAlign w:val="superscript"/>
     </w:rPr>
   </w:style>
+  <w:style w:type="character" w:styleId="EndnoteCharacters">
+    <w:name w:val="Endnote Characters"/>
+    <w:qFormat/>
+    <w:rPr>
+      <w:vertAlign w:val="superscript"/>
+    </w:rPr>
+  </w:style>
   <w:style w:type="character" w:styleId="EndnoteReference">
     <w:name w:val="Endnote Reference"/>
     <w:rPr>
@@ -10394,6 +10713,13 @@
       <w:vertAlign w:val="superscript"/>
     </w:rPr>
   </w:style>
+  <w:style w:type="character" w:styleId="FootnoteCharacters">
+    <w:name w:val="Footnote Characters"/>
+    <w:qFormat/>
+    <w:rPr>
+      <w:vertAlign w:val="superscript"/>
+    </w:rPr>
+  </w:style>
   <w:style w:type="character" w:styleId="FootnoteReference">
     <w:name w:val="Footnote Reference"/>
     <w:rPr>
@@ -10407,8 +10733,8 @@
     <w:rsid w:val="00186e60"/>
     <w:rPr/>
   </w:style>
-  <w:style w:type="paragraph" w:styleId="Ttulo">
-    <w:name w:val="Título"/>
+  <w:style w:type="paragraph" w:styleId="Heading">
+    <w:name w:val="Heading"/>
     <w:basedOn w:val="Normal"/>
     <w:next w:val="BodyText"/>
     <w:qFormat/>
@@ -10417,7 +10743,7 @@
       <w:spacing w:before="240" w:after="120"/>
     </w:pPr>
     <w:rPr>
-      <w:rFonts w:ascii="Liberation Sans" w:hAnsi="Liberation Sans" w:eastAsia="Noto Sans CJK SC" w:cs="FreeSans"/>
+      <w:rFonts w:ascii="Liberation Sans" w:hAnsi="Liberation Sans" w:eastAsia="Noto Sans CJK SC" w:cs="Lohit Devanagari"/>
       <w:sz w:val="28"/>
       <w:szCs w:val="28"/>
     </w:rPr>
@@ -10452,6 +10778,32 @@
       <w:iCs/>
       <w:sz w:val="24"/>
       <w:szCs w:val="24"/>
+    </w:rPr>
+  </w:style>
+  <w:style w:type="paragraph" w:styleId="Index">
+    <w:name w:val="Index"/>
+    <w:basedOn w:val="Normal"/>
+    <w:qFormat/>
+    <w:pPr>
+      <w:suppressLineNumbers/>
+    </w:pPr>
+    <w:rPr>
+      <w:rFonts w:cs="Lohit Devanagari"/>
+    </w:rPr>
+  </w:style>
+  <w:style w:type="paragraph" w:styleId="Ttulo">
+    <w:name w:val="Título"/>
+    <w:basedOn w:val="Normal"/>
+    <w:next w:val="BodyText"/>
+    <w:qFormat/>
+    <w:pPr>
+      <w:keepNext w:val="true"/>
+      <w:spacing w:before="240" w:after="120"/>
+    </w:pPr>
+    <w:rPr>
+      <w:rFonts w:ascii="Liberation Sans" w:hAnsi="Liberation Sans" w:eastAsia="Noto Sans CJK SC" w:cs="FreeSans"/>
+      <w:sz w:val="28"/>
+      <w:szCs w:val="28"/>
     </w:rPr>
   </w:style>
   <w:style w:type="paragraph" w:styleId="Ndice">
@@ -10554,6 +10906,13 @@
   </w:style>
   <w:style w:type="paragraph" w:styleId="Cabeceraypie">
     <w:name w:val="Cabecera y pie"/>
+    <w:basedOn w:val="Normal"/>
+    <w:qFormat/>
+    <w:pPr/>
+    <w:rPr/>
+  </w:style>
+  <w:style w:type="paragraph" w:styleId="HeaderandFooter">
+    <w:name w:val="Header and Footer"/>
     <w:basedOn w:val="Normal"/>
     <w:qFormat/>
     <w:pPr/>

</xml_diff>